<commit_message>
Update project brief (Project Notes/Assessment_Screener_Project_Brief.docx)
</commit_message>
<xml_diff>
--- a/Project Notes/Assessment_Screener_Project_Brief.docx
+++ b/Project Notes/Assessment_Screener_Project_Brief.docx
@@ -89,7 +89,7 @@
         <w:rPr>
           <w:noProof/>
         </w:rPr>
-        <w:pict w14:anchorId="1EAD9474">
+        <w:pict w14:anchorId="49FB0F3B">
           <v:rect id="_x0000_i1035" alt="" style="width:468pt;height:.05pt;mso-width-percent:0;mso-height-percent:0;mso-width-percent:0;mso-height-percent:0" o:hralign="center" o:hrstd="t" o:hr="t" fillcolor="#a0a0a0" stroked="f"/>
         </w:pict>
       </w:r>
@@ -228,7 +228,7 @@
         <w:rPr>
           <w:noProof/>
         </w:rPr>
-        <w:pict w14:anchorId="58945DDE">
+        <w:pict w14:anchorId="7B026E5C">
           <v:rect id="_x0000_i1034" alt="" style="width:468pt;height:.05pt;mso-width-percent:0;mso-height-percent:0;mso-width-percent:0;mso-height-percent:0" o:hralign="center" o:hrstd="t" o:hr="t" fillcolor="#a0a0a0" stroked="f"/>
         </w:pict>
       </w:r>
@@ -385,7 +385,7 @@
         <w:rPr>
           <w:noProof/>
         </w:rPr>
-        <w:pict w14:anchorId="31539503">
+        <w:pict w14:anchorId="3871E380">
           <v:rect id="_x0000_i1033" alt="" style="width:468pt;height:.05pt;mso-width-percent:0;mso-height-percent:0;mso-width-percent:0;mso-height-percent:0" o:hralign="center" o:hrstd="t" o:hr="t" fillcolor="#a0a0a0" stroked="f"/>
         </w:pict>
       </w:r>
@@ -641,7 +641,7 @@
         <w:rPr>
           <w:noProof/>
         </w:rPr>
-        <w:pict w14:anchorId="5F12B605">
+        <w:pict w14:anchorId="11C39479">
           <v:rect id="_x0000_i1032" alt="" style="width:468pt;height:.05pt;mso-width-percent:0;mso-height-percent:0;mso-width-percent:0;mso-height-percent:0" o:hralign="center" o:hrstd="t" o:hr="t" fillcolor="#a0a0a0" stroked="f"/>
         </w:pict>
       </w:r>
@@ -744,7 +744,7 @@
         <w:rPr>
           <w:noProof/>
         </w:rPr>
-        <w:pict w14:anchorId="20AC0D22">
+        <w:pict w14:anchorId="32E0ED6B">
           <v:rect id="_x0000_i1031" alt="" style="width:468pt;height:.05pt;mso-width-percent:0;mso-height-percent:0;mso-width-percent:0;mso-height-percent:0" o:hralign="center" o:hrstd="t" o:hr="t" fillcolor="#a0a0a0" stroked="f"/>
         </w:pict>
       </w:r>
@@ -1078,7 +1078,7 @@
         <w:rPr>
           <w:noProof/>
         </w:rPr>
-        <w:pict w14:anchorId="52079304">
+        <w:pict w14:anchorId="29CC944D">
           <v:rect id="_x0000_i1030" alt="" style="width:468pt;height:.05pt;mso-width-percent:0;mso-height-percent:0;mso-width-percent:0;mso-height-percent:0" o:hralign="center" o:hrstd="t" o:hr="t" fillcolor="#a0a0a0" stroked="f"/>
         </w:pict>
       </w:r>
@@ -1268,7 +1268,7 @@
         <w:rPr>
           <w:noProof/>
         </w:rPr>
-        <w:pict w14:anchorId="5B1EAEB8">
+        <w:pict w14:anchorId="6A6FD3C2">
           <v:rect id="_x0000_i1029" alt="" style="width:468pt;height:.05pt;mso-width-percent:0;mso-height-percent:0;mso-width-percent:0;mso-height-percent:0" o:hralign="center" o:hrstd="t" o:hr="t" fillcolor="#a0a0a0" stroked="f"/>
         </w:pict>
       </w:r>
@@ -1380,7 +1380,7 @@
         <w:rPr>
           <w:noProof/>
         </w:rPr>
-        <w:pict w14:anchorId="05699A10">
+        <w:pict w14:anchorId="57E36015">
           <v:rect id="_x0000_i1028" alt="" style="width:468pt;height:.05pt;mso-width-percent:0;mso-height-percent:0;mso-width-percent:0;mso-height-percent:0" o:hralign="center" o:hrstd="t" o:hr="t" fillcolor="#a0a0a0" stroked="f"/>
         </w:pict>
       </w:r>
@@ -1518,7 +1518,7 @@
         <w:rPr>
           <w:noProof/>
         </w:rPr>
-        <w:pict w14:anchorId="13340119">
+        <w:pict w14:anchorId="6EDF25EA">
           <v:rect id="_x0000_i1027" alt="" style="width:468pt;height:.05pt;mso-width-percent:0;mso-height-percent:0;mso-width-percent:0;mso-height-percent:0" o:hralign="center" o:hrstd="t" o:hr="t" fillcolor="#a0a0a0" stroked="f"/>
         </w:pict>
       </w:r>
@@ -2083,7 +2083,7 @@
         <w:rPr>
           <w:noProof/>
         </w:rPr>
-        <w:pict w14:anchorId="0F7B531D">
+        <w:pict w14:anchorId="131366B6">
           <v:rect id="_x0000_i1026" alt="" style="width:468pt;height:.05pt;mso-width-percent:0;mso-height-percent:0;mso-width-percent:0;mso-height-percent:0" o:hralign="center" o:hrstd="t" o:hr="t" fillcolor="#a0a0a0" stroked="f"/>
         </w:pict>
       </w:r>
@@ -2188,7 +2188,7 @@
         <w:rPr>
           <w:noProof/>
         </w:rPr>
-        <w:pict w14:anchorId="4DB2CCBE">
+        <w:pict w14:anchorId="64942D0C">
           <v:rect id="_x0000_i1025" alt="" style="width:468pt;height:.05pt;mso-width-percent:0;mso-height-percent:0;mso-width-percent:0;mso-height-percent:0" o:hralign="center" o:hrstd="t" o:hr="t" fillcolor="#a0a0a0" stroked="f"/>
         </w:pict>
       </w:r>
@@ -2248,6 +2248,26 @@
       </w:r>
     </w:p>
     <w:p/>
+    <w:p>
+      <w:pPr>
+        <w:pStyle w:val="Heading2"/>
+      </w:pPr>
+      <w:r>
+        <w:t>Ongoing Ideas</w:t>
+      </w:r>
+    </w:p>
+    <w:p>
+      <w:pPr>
+        <w:pStyle w:val="ListParagraph"/>
+        <w:numPr>
+          <w:ilvl w:val="0"/>
+          <w:numId w:val="1"/>
+        </w:numPr>
+      </w:pPr>
+      <w:r>
+        <w:t xml:space="preserve">Self-improving via user input. As more users generate estimates, they can provide feedback saying their values are over or under what’s fair. From there, as the system accumulates more data, it can better gauge the cap rates and assessments cities are applying to properties and highlight trends in different property types or submarkets. </w:t>
+      </w:r>
+    </w:p>
     <w:sectPr>
       <w:pgSz w:w="12240" w:h="15840"/>
       <w:pgMar w:top="1440" w:right="1440" w:bottom="1440" w:left="1440" w:header="0" w:footer="720" w:gutter="0"/>
@@ -3524,6 +3544,17 @@
       <w:tblStyleColBandSize w:val="1"/>
     </w:tblPr>
   </w:style>
+  <w:style w:type="paragraph" w:styleId="ListParagraph">
+    <w:name w:val="List Paragraph"/>
+    <w:basedOn w:val="Normal"/>
+    <w:uiPriority w:val="34"/>
+    <w:qFormat/>
+    <w:rsid w:val="00617DFE"/>
+    <w:pPr>
+      <w:ind w:left="720"/>
+      <w:contextualSpacing/>
+    </w:pPr>
+  </w:style>
 </w:styles>
 </file>
 

</xml_diff>